<commit_message>
Update Batch 6 JDs and Ads: Training Sales Rep and Events Sales Rep get IC-to-manager growth path. Events Sales Rep gets travel budget and company card. Both JDs and Ads updated.
</commit_message>
<xml_diff>
--- a/careers/ads/Batch6_Ads_Creative_Learning_Sales.docx
+++ b/careers/ads/Batch6_Ads_Creative_Learning_Sales.docx
@@ -1567,7 +1567,7 @@
           <w:sz w:val="22"/>
           <w:szCs w:val="22"/>
         </w:rPr>
-        <w:t xml:space="preserve">Audacion AI Labs built the first PRISM-framework certification for post-deployment AI safety. The Training and Certification Sales Rep sells it: enterprise cohorts, individual enrollments, university partnerships, and ongoing training subscriptions.</w:t>
+        <w:t xml:space="preserve">Audacion AI Labs built the first PRISM-framework certification for post-deployment AI safety. The Training and Certification Sales Rep sells it: enterprise cohorts, individual enrollments, university partnerships, and ongoing training subscriptions. Start as an individual contributor. Hit your first three revenue milestones and earn the right to build your own training sales team.</w:t>
       </w:r>
     </w:p>
     <w:p>
@@ -2002,7 +2002,7 @@
           <w:sz w:val="22"/>
           <w:szCs w:val="22"/>
         </w:rPr>
-        <w:t xml:space="preserve">Audacion AI Labs runs an annual summit, quarterly golf tournaments, monthly roundtables, think tanks, virtual conferences, hackathons, retreats, and telethons. Combined, these events are projected to generate $3M or more annually. The Events and Sponsorship Sales Rep builds the sponsorship and premium attendance pipeline that funds it all.</w:t>
+        <w:t xml:space="preserve">Audacion AI Labs runs an annual summit, quarterly golf tournaments, monthly roundtables, think tanks, virtual conferences, hackathons, retreats, and telethons. Combined, these events are projected to generate $3M or more annually. The Events and Sponsorship Sales Rep builds the sponsorship and premium attendance pipeline that funds it all. Start as an individual contributor. Hit your first three milestones and build your own events sales team. This role includes a travel budget and company credit card for sponsor meetings, venue site visits, and event attendance.</w:t>
       </w:r>
     </w:p>
     <w:p>

</xml_diff>